<commit_message>
docs: sửa đánh số trong bản Word hướng dẫn quảng cáo
Co-Authored-By: Claude Fable 5.1 <noreply@anthropic.com>
</commit_message>
<xml_diff>
--- a/fb/Huong-dan-tu-chay-quang-cao.docx
+++ b/fb/Huong-dan-tu-chay-quang-cao.docx
@@ -228,16 +228,28 @@
     </w:p>
     <w:p>
       <w:pPr>
-        <w:pStyle w:val="ListNumber"/>
+        <w:ind w:left="510" w:hanging="340"/>
       </w:pPr>
+      <w:r>
+        <w:rPr>
+          <w:b/>
+        </w:rPr>
+        <w:t xml:space="preserve">1.  </w:t>
+      </w:r>
       <w:r>
         <w:t>Vào https://business.facebook.com, chọn trang Thiên Phú Travel.</w:t>
       </w:r>
     </w:p>
     <w:p>
       <w:pPr>
-        <w:pStyle w:val="ListNumber"/>
+        <w:ind w:left="510" w:hanging="340"/>
       </w:pPr>
+      <w:r>
+        <w:rPr>
+          <w:b/>
+        </w:rPr>
+        <w:t xml:space="preserve">2.  </w:t>
+      </w:r>
       <w:r>
         <w:t xml:space="preserve">Thấy dải đỏ "Bạn đã hết tiền trong quỹ trả trước" → bấm </w:t>
       </w:r>
@@ -253,8 +265,14 @@
     </w:p>
     <w:p>
       <w:pPr>
-        <w:pStyle w:val="ListNumber"/>
+        <w:ind w:left="510" w:hanging="340"/>
       </w:pPr>
+      <w:r>
+        <w:rPr>
+          <w:b/>
+        </w:rPr>
+        <w:t xml:space="preserve">3.  </w:t>
+      </w:r>
       <w:r>
         <w:t xml:space="preserve">Chọn số tiền: tuần đầu nên nạp </w:t>
       </w:r>
@@ -270,16 +288,28 @@
     </w:p>
     <w:p>
       <w:pPr>
-        <w:pStyle w:val="ListNumber"/>
+        <w:ind w:left="510" w:hanging="340"/>
       </w:pPr>
+      <w:r>
+        <w:rPr>
+          <w:b/>
+        </w:rPr>
+        <w:t xml:space="preserve">4.  </w:t>
+      </w:r>
       <w:r>
         <w:t>Chọn cách trả: thẻ Visa/Mastercard, hoặc ví MoMo, hoặc chuyển khoản. Làm theo màn hình.</w:t>
       </w:r>
     </w:p>
     <w:p>
       <w:pPr>
-        <w:pStyle w:val="ListNumber"/>
+        <w:ind w:left="510" w:hanging="340"/>
       </w:pPr>
+      <w:r>
+        <w:rPr>
+          <w:b/>
+        </w:rPr>
+        <w:t xml:space="preserve">5.  </w:t>
+      </w:r>
       <w:r>
         <w:t>Nạp xong, dải đỏ biến mất.</w:t>
       </w:r>
@@ -304,8 +334,14 @@
     </w:p>
     <w:p>
       <w:pPr>
-        <w:pStyle w:val="ListNumber"/>
+        <w:ind w:left="510" w:hanging="340"/>
       </w:pPr>
+      <w:r>
+        <w:rPr>
+          <w:b/>
+        </w:rPr>
+        <w:t xml:space="preserve">1.  </w:t>
+      </w:r>
       <w:r>
         <w:t xml:space="preserve">Business Suite → menu trái </w:t>
       </w:r>
@@ -330,8 +366,14 @@
     </w:p>
     <w:p>
       <w:pPr>
-        <w:pStyle w:val="ListNumber"/>
+        <w:ind w:left="510" w:hanging="340"/>
       </w:pPr>
+      <w:r>
+        <w:rPr>
+          <w:b/>
+        </w:rPr>
+        <w:t xml:space="preserve">2.  </w:t>
+      </w:r>
       <w:r>
         <w:t xml:space="preserve">Chọn mục tiêu: </w:t>
       </w:r>
@@ -347,8 +389,14 @@
     </w:p>
     <w:p>
       <w:pPr>
-        <w:pStyle w:val="ListNumber"/>
+        <w:ind w:left="510" w:hanging="340"/>
       </w:pPr>
+      <w:r>
+        <w:rPr>
+          <w:b/>
+        </w:rPr>
+        <w:t xml:space="preserve">3.  </w:t>
+      </w:r>
       <w:r>
         <w:t>Màn hình thiết lập, điền từng ô như bảng dưới.</w:t>
       </w:r>
@@ -701,8 +749,14 @@
     <w:p/>
     <w:p>
       <w:pPr>
-        <w:pStyle w:val="ListNumber"/>
+        <w:ind w:left="510" w:hanging="340"/>
       </w:pPr>
+      <w:r>
+        <w:rPr>
+          <w:b/>
+        </w:rPr>
+        <w:t xml:space="preserve">4.  </w:t>
+      </w:r>
       <w:r>
         <w:t xml:space="preserve">Bấm </w:t>
       </w:r>

</xml_diff>